<commit_message>
feat: add secure client connection setup and release handoff
</commit_message>
<xml_diff>
--- a/Documentation/Reports/ProjectReport.docx
+++ b/Documentation/Reports/ProjectReport.docx
@@ -56,7 +56,7 @@
     </w:p>
     <w:p>
       <w:r>
-        <w:t>Bản hiện hành đã có bằng chứng build thành công và 169 unit test đạt. Các kiểm tra SQL, giao diện và file xuất được phân biệt theo đợt thực hiện. Những thay đổi mới ngày 15 tháng 10 vẫn cần nghiệm thu SQL ghi và giao diện trực tiếp trước khi xác nhận hoàn tất toàn hệ thống.</w:t>
+        <w:t>Bản bàn giao ngày 15 tháng 10 năm 2026 build 7 project đạt 0 lỗi, 0 cảnh báo; tổng 179 tests đạt gồm 169 unit nghiệp vụ, 5 SQL trên TEST và 5 ca cấu hình/DPAPI. Native UI, xuất file và triển khai cục bộ có bằng chứng theo phạm vi kiểm tra; kết nối VPN từ máy khác, máy sạch, mọi DPI và máy in vẫn chưa được nghiệm thu đầy đủ.</w:t>
       </w:r>
     </w:p>
     <w:p>
@@ -766,7 +766,7 @@
     </w:p>
     <w:p>
       <w:r>
-        <w:t>Bảo Anh phối hợp kiểm tra migration, constraint và môi trường triển khai; Khang kiểm thử SQL ghi, rollback và cạnh tranh đồng thời cho nghiệp vụ mới; Khiêm nghiệm thu UI trực tiếp, DPI, bàn phím và xuất/in. Đây là đầu việc nghiệm thu theo chuyên môn, không phải khẳng định các thành viên chưa thực hiện phần triển khai được mô tả ở trên.</w:t>
+        <w:t>Phần việc nghiệm thu tiếp tục theo chuyên môn gồm backup/restore và môi trường server của Bảo Anh; kiểm tra quyền runtime và các workflow trên môi trường triển khai của Khang; máy khách, DPI, bàn phím và in của Khiêm. Không lấy kết quả unit/SQL trên TEST thay cho mọi ca UI hoặc vận hành production.</w:t>
       </w:r>
     </w:p>
     <w:p>
@@ -1320,7 +1320,7 @@
         <w:pStyle w:val="Heading2"/>
       </w:pPr>
       <w:r>
-        <w:t>Quan hệ giữa sáu project</w:t>
+        <w:t>Quan hệ giữa các project trong solution</w:t>
       </w:r>
     </w:p>
     <w:p>
@@ -1692,7 +1692,7 @@
     </w:p>
     <w:p>
       <w:r>
-        <w:t>UI và EF CLI dùng SMART_INVENTORY_CONNECTION_STRING; UI có fallback App.config hiện hữu, còn Setup yêu cầu biến môi trường. Không đưa chuỗi chứa bí mật vào báo cáo hoặc Git. Môi trường production tách riêng và chưa được nghiệm thu trong đợt hiện tại.</w:t>
+        <w:t>UI ưu tiên SMART_INVENTORY_CONNECTION_STRING, sau đó profile DPAPI theo người dùng Windows và XML legacy; Setup/EF CLI dùng biến môi trường. Không đưa bí mật vào báo cáo hoặc Git. DB mới trên Express đã có migrations và ADMIN; kết nối local được xác nhận, nghiệm thu mạng/backup và vận hành production còn tiếp tục.</w:t>
       </w:r>
     </w:p>
     <w:p>
@@ -3407,11 +3407,10 @@
           </w:tcPr>
           <w:p>
             <w:pPr>
-              <w:spacing w:after="100" w:before="80"/>
+              <w:spacing w:after="80"/>
             </w:pPr>
             <w:r>
               <w:rPr>
-                <w:b w:val="0"/>
                 <w:sz w:val="20"/>
               </w:rPr>
               <w:t>Build ngày 15 tháng 10</w:t>
@@ -3424,14 +3423,13 @@
           </w:tcPr>
           <w:p>
             <w:pPr>
-              <w:spacing w:after="100" w:before="80"/>
+              <w:spacing w:after="80"/>
             </w:pPr>
             <w:r>
               <w:rPr>
-                <w:b w:val="0"/>
                 <w:sz w:val="20"/>
               </w:rPr>
-              <w:t>0 lỗi và 0 cảnh báo</w:t>
+              <w:t>7 project, 0 lỗi và 0 cảnh báo</w:t>
             </w:r>
           </w:p>
         </w:tc>
@@ -3441,11 +3439,10 @@
           </w:tcPr>
           <w:p>
             <w:pPr>
-              <w:spacing w:after="100" w:before="80"/>
+              <w:spacing w:after="80"/>
             </w:pPr>
             <w:r>
               <w:rPr>
-                <w:b w:val="0"/>
                 <w:sz w:val="20"/>
               </w:rPr>
               <w:t>Không thay kiểm thử giao diện</w:t>
@@ -3463,11 +3460,10 @@
           </w:tcPr>
           <w:p>
             <w:pPr>
-              <w:spacing w:after="100" w:before="80"/>
+              <w:spacing w:after="80"/>
             </w:pPr>
             <w:r>
               <w:rPr>
-                <w:b w:val="0"/>
                 <w:sz w:val="20"/>
               </w:rPr>
               <w:t>Unit ngày 15 tháng 10</w:t>
@@ -3480,14 +3476,13 @@
           </w:tcPr>
           <w:p>
             <w:pPr>
-              <w:spacing w:after="100" w:before="80"/>
+              <w:spacing w:after="80"/>
             </w:pPr>
             <w:r>
               <w:rPr>
-                <w:b w:val="0"/>
                 <w:sz w:val="20"/>
               </w:rPr>
-              <w:t>169 đạt, 0 lỗi, 0 bỏ qua</w:t>
+              <w:t>169 nghiệp vụ và 5 cấu hình/DPAPI đạt</w:t>
             </w:r>
           </w:p>
         </w:tc>
@@ -3497,14 +3492,13 @@
           </w:tcPr>
           <w:p>
             <w:pPr>
-              <w:spacing w:after="100" w:before="80"/>
+              <w:spacing w:after="80"/>
             </w:pPr>
             <w:r>
               <w:rPr>
-                <w:b w:val="0"/>
                 <w:sz w:val="20"/>
               </w:rPr>
-              <w:t>EF InMemory không chứng minh SQL lock hoặc rollback</w:t>
+              <w:t>InMemory không chứng minh SQL lock/rollback</w:t>
             </w:r>
           </w:p>
         </w:tc>
@@ -3519,11 +3513,10 @@
           </w:tcPr>
           <w:p>
             <w:pPr>
-              <w:spacing w:after="100" w:before="80"/>
+              <w:spacing w:after="80"/>
             </w:pPr>
             <w:r>
               <w:rPr>
-                <w:b w:val="0"/>
                 <w:sz w:val="20"/>
               </w:rPr>
               <w:t>Schema ngày 15 tháng 10</w:t>
@@ -3536,14 +3529,13 @@
           </w:tcPr>
           <w:p>
             <w:pPr>
-              <w:spacing w:after="100" w:before="80"/>
+              <w:spacing w:after="80"/>
             </w:pPr>
             <w:r>
               <w:rPr>
-                <w:b w:val="0"/>
                 <w:sz w:val="20"/>
               </w:rPr>
-              <w:t>19 entity, 6 migration; TEST không pending/model diff</w:t>
+              <w:t>19 bảng, 6 migrations; TEST và Express mới khớp model</w:t>
             </w:r>
           </w:p>
         </w:tc>
@@ -3553,14 +3545,13 @@
           </w:tcPr>
           <w:p>
             <w:pPr>
-              <w:spacing w:after="100" w:before="80"/>
+              <w:spacing w:after="80"/>
             </w:pPr>
             <w:r>
               <w:rPr>
-                <w:b w:val="0"/>
                 <w:sz w:val="20"/>
               </w:rPr>
-              <w:t>Chưa triển khai production</w:t>
+              <w:t>Mạng/backup production còn chờ nghiệm thu</w:t>
             </w:r>
           </w:p>
         </w:tc>
@@ -3575,14 +3566,13 @@
           </w:tcPr>
           <w:p>
             <w:pPr>
-              <w:spacing w:after="100" w:before="80"/>
+              <w:spacing w:after="80"/>
             </w:pPr>
             <w:r>
               <w:rPr>
-                <w:b w:val="0"/>
                 <w:sz w:val="20"/>
               </w:rPr>
-              <w:t>SQL đọc ngày 15 tháng 10</w:t>
+              <w:t>Quyền runtime SQL</w:t>
             </w:r>
           </w:p>
         </w:tc>
@@ -3592,14 +3582,13 @@
           </w:tcPr>
           <w:p>
             <w:pPr>
-              <w:spacing w:after="100" w:before="80"/>
+              <w:spacing w:after="80"/>
             </w:pPr>
             <w:r>
               <w:rPr>
-                <w:b w:val="0"/>
                 <w:sz w:val="20"/>
               </w:rPr>
-              <w:t>Phân trang thực tế đủ ID; không trùng định danh; manager hợp lệ</w:t>
+              <w:t>Login ứng dụng đọc 19 bảng; không sysadmin/db_owner/schema</w:t>
             </w:r>
           </w:p>
         </w:tc>
@@ -3609,14 +3598,13 @@
           </w:tcPr>
           <w:p>
             <w:pPr>
-              <w:spacing w:after="100" w:before="80"/>
+              <w:spacing w:after="80"/>
             </w:pPr>
             <w:r>
               <w:rPr>
-                <w:b w:val="0"/>
                 <w:sz w:val="20"/>
               </w:rPr>
-              <w:t>Không ghi dữ liệu và không test race account</w:t>
+              <w:t>Chưa nghiệm thu độc lập mọi thao tác ghi production</w:t>
             </w:r>
           </w:p>
         </w:tc>
@@ -3631,14 +3619,13 @@
           </w:tcPr>
           <w:p>
             <w:pPr>
-              <w:spacing w:after="100" w:before="80"/>
+              <w:spacing w:after="80"/>
             </w:pPr>
             <w:r>
               <w:rPr>
-                <w:b w:val="0"/>
                 <w:sz w:val="20"/>
               </w:rPr>
-              <w:t>SQL tích hợp ngày 14 tháng 10</w:t>
+              <w:t>SQL tích hợp ngày 15 tháng 10</w:t>
             </w:r>
           </w:p>
         </w:tc>
@@ -3648,14 +3635,13 @@
           </w:tcPr>
           <w:p>
             <w:pPr>
-              <w:spacing w:after="100" w:before="80"/>
+              <w:spacing w:after="80"/>
             </w:pPr>
             <w:r>
               <w:rPr>
-                <w:b w:val="0"/>
                 <w:sz w:val="20"/>
               </w:rPr>
-              <w:t>4 test đạt cho các nhóm posting, concurrency, rollback, deadlock và Dashboard</w:t>
+              <w:t>5 tests đạt; posting/race/rollback/deadlock/lifecycle/account</w:t>
             </w:r>
           </w:p>
         </w:tc>
@@ -3665,14 +3651,13 @@
           </w:tcPr>
           <w:p>
             <w:pPr>
-              <w:spacing w:after="100" w:before="80"/>
+              <w:spacing w:after="80"/>
             </w:pPr>
             <w:r>
               <w:rPr>
-                <w:b w:val="0"/>
                 <w:sz w:val="20"/>
               </w:rPr>
-              <w:t>Chưa chạy lại sau lifecycle và account mới</w:t>
+              <w:t>Chỉ trên TEST; ADMIN cuối cùng SQL cô lập còn thiếu</w:t>
             </w:r>
           </w:p>
         </w:tc>
@@ -3687,14 +3672,13 @@
           </w:tcPr>
           <w:p>
             <w:pPr>
-              <w:spacing w:after="100" w:before="80"/>
+              <w:spacing w:after="80"/>
             </w:pPr>
             <w:r>
               <w:rPr>
-                <w:b w:val="0"/>
                 <w:sz w:val="20"/>
               </w:rPr>
-              <w:t>Native UI ngày 14 tháng 10</w:t>
+              <w:t>Native UI ngày 15 tháng 10</w:t>
             </w:r>
           </w:p>
         </w:tc>
@@ -3704,14 +3688,13 @@
           </w:tcPr>
           <w:p>
             <w:pPr>
-              <w:spacing w:after="100" w:before="80"/>
+              <w:spacing w:after="80"/>
             </w:pPr>
             <w:r>
               <w:rPr>
-                <w:b w:val="0"/>
                 <w:sz w:val="20"/>
               </w:rPr>
-              <w:t>Dashboard, analytics, lọc danh mục, cảnh báo, history và màu chọn/scroll có bằng chứng</w:t>
+              <w:t>ADMIN phiếu/history/report và cấu hình mới có kiểm tra</w:t>
             </w:r>
           </w:p>
         </w:tc>
@@ -3721,14 +3704,13 @@
           </w:tcPr>
           <w:p>
             <w:pPr>
-              <w:spacing w:after="100" w:before="80"/>
+              <w:spacing w:after="80"/>
             </w:pPr>
             <w:r>
               <w:rPr>
-                <w:b w:val="0"/>
                 <w:sz w:val="20"/>
               </w:rPr>
-              <w:t>Chưa bao phủ thay đổi mới và mọi DPI</w:t>
+              <w:t>Chưa mọi role, DPI, máy sạch hoặc VPN máy khác</w:t>
             </w:r>
           </w:p>
         </w:tc>
@@ -3743,14 +3725,13 @@
           </w:tcPr>
           <w:p>
             <w:pPr>
-              <w:spacing w:after="100" w:before="80"/>
+              <w:spacing w:after="80"/>
             </w:pPr>
             <w:r>
               <w:rPr>
-                <w:b w:val="0"/>
                 <w:sz w:val="20"/>
               </w:rPr>
-              <w:t>Xuất file ngày 14 tháng 10</w:t>
+              <w:t>Xuất file ngày 15 tháng 10</w:t>
             </w:r>
           </w:p>
         </w:tc>
@@ -3760,14 +3741,13 @@
           </w:tcPr>
           <w:p>
             <w:pPr>
-              <w:spacing w:after="100" w:before="80"/>
+              <w:spacing w:after="80"/>
             </w:pPr>
             <w:r>
               <w:rPr>
-                <w:b w:val="0"/>
                 <w:sz w:val="20"/>
               </w:rPr>
-              <w:t>3 PDF và 3 Excel; đối chiếu số liệu và mẫu nhiều dòng</w:t>
+              <w:t>3 PDF, 3 Excel và native Excel; PDF phiếu60dòng/5trang có audit</w:t>
             </w:r>
           </w:p>
         </w:tc>
@@ -3777,14 +3757,13 @@
           </w:tcPr>
           <w:p>
             <w:pPr>
-              <w:spacing w:after="100" w:before="80"/>
+              <w:spacing w:after="80"/>
             </w:pPr>
             <w:r>
               <w:rPr>
-                <w:b w:val="0"/>
                 <w:sz w:val="20"/>
               </w:rPr>
-              <w:t>PDF audit mới cần nghiệm thu lại</w:t>
+              <w:t>Chưa máy in giấy hoặc dữ liệu rất lớn</w:t>
             </w:r>
           </w:p>
         </w:tc>
@@ -4425,7 +4404,7 @@
     </w:p>
     <w:p>
       <w:r>
-        <w:t>Dự án đã tích hợp các luồng vận hành kho chủ yếu với phân quyền, transaction và audit xuyên suốt. Giá trị chính là đưa việc lập phiếu, thay đổi tồn và tra cứu trách nhiệm vào cùng một quy trình. Trước nghiệm thu cuối cần hoàn thành kiểm thử SQL và UI cho thay đổi mới, kiểm tra xuất/in thực tế và chuẩn bị kế hoạch triển khai production.</w:t>
+        <w:t>Dự án đã tích hợp các luồng vận hành kho chủ yếu với phân quyền, transaction và audit xuyên suốt. Việc lập phiếu, thay đổi tồn và tra cứu trách nhiệm được đưa vào cùng một quy trình. Bản cài hỗ trợ cấu hình kết nối an toàn và cài trước, cấp quyền sau. Trước dùng thật cần hoàn thành nghiệm thu máy khách qua VPN, backup/restore, cài mới/cập nhật và các giới hạn UI/in đã ghi nhận.</w:t>
       </w:r>
     </w:p>
     <w:p>
@@ -4438,12 +4417,545 @@
         <w:pStyle w:val="Heading1"/>
       </w:pPr>
       <w:r>
-        <w:t>16 Nguồn đối chiếu và dấu vết phiên bản</w:t>
+        <w:rPr>
+          <w:color w:val="000000"/>
+        </w:rPr>
+        <w:t>16 Đóng gói và vận hành máy chủ</w:t>
       </w:r>
     </w:p>
     <w:p>
       <w:r>
-        <w:t>Ngày chốt nội dung 15 tháng 10 năm 2026. Mốc code gồm Business 06fc858, UI adca0b7 và đồng bộ tài liệu 6e1091b trên nhánh Backend. Các số kiểm thử nêu trong báo cáo là kết quả đã ghi nhận theo ngày, không phải một lần chạy test mới chỉ để viết tài liệu.</w:t>
+        <w:t>Bản bàn giao Windows x64 sử dụng VioWare self-contained, Inno Setup và SQL Server Express. Người nhận có thể cài phần mềm trước khi được cấp quyền mạng. Quản trị viên duyệt truy cập server và cung cấp tài khoản VioWare sau; máy khách không tự tạo ADMIN hoặc chạy migrations.</w:t>
+      </w:r>
+    </w:p>
+    <w:p>
+      <w:pPr>
+        <w:pStyle w:val="Heading2"/>
+      </w:pPr>
+      <w:r>
+        <w:rPr>
+          <w:color w:val="000000"/>
+        </w:rPr>
+        <w:t>Phần mềm và công nghệ sử dụng</w:t>
+      </w:r>
+    </w:p>
+    <w:tbl>
+      <w:tblPr>
+        <w:tblW w:type="auto" w:w="0"/>
+        <w:tblLayout w:type="fixed"/>
+        <w:tblLook w:firstColumn="1" w:firstRow="1" w:lastColumn="0" w:lastRow="0" w:noHBand="0" w:noVBand="1" w:val="04A0"/>
+      </w:tblPr>
+      <w:tblGrid>
+        <w:gridCol w:w="2448"/>
+        <w:gridCol w:w="6912"/>
+      </w:tblGrid>
+      <w:tr>
+        <w:trPr>
+          <w:cantSplit/>
+          <w:tblHeader/>
+        </w:trPr>
+        <w:tc>
+          <w:tcPr>
+            <w:tcW w:type="dxa" w:w="2448"/>
+            <w:shd w:fill="E9EDF2"/>
+          </w:tcPr>
+          <w:p>
+            <w:pPr>
+              <w:spacing w:after="100" w:before="80"/>
+            </w:pPr>
+            <w:r>
+              <w:rPr>
+                <w:rFonts w:ascii="Calibri" w:hAnsi="Calibri"/>
+                <w:b/>
+                <w:color w:val="000000"/>
+                <w:sz w:val="20"/>
+              </w:rPr>
+              <w:t>Thành phần</w:t>
+            </w:r>
+          </w:p>
+        </w:tc>
+        <w:tc>
+          <w:tcPr>
+            <w:tcW w:type="dxa" w:w="6912"/>
+            <w:shd w:fill="E9EDF2"/>
+          </w:tcPr>
+          <w:p>
+            <w:pPr>
+              <w:spacing w:after="100" w:before="80"/>
+            </w:pPr>
+            <w:r>
+              <w:rPr>
+                <w:rFonts w:ascii="Calibri" w:hAnsi="Calibri"/>
+                <w:b/>
+                <w:color w:val="000000"/>
+                <w:sz w:val="20"/>
+              </w:rPr>
+              <w:t>Vai trò trong triển khai</w:t>
+            </w:r>
+          </w:p>
+        </w:tc>
+      </w:tr>
+      <w:tr>
+        <w:trPr>
+          <w:cantSplit/>
+        </w:trPr>
+        <w:tc>
+          <w:tcPr>
+            <w:tcW w:type="dxa" w:w="2448"/>
+          </w:tcPr>
+          <w:p>
+            <w:pPr>
+              <w:spacing w:after="100" w:before="80"/>
+            </w:pPr>
+            <w:r>
+              <w:rPr>
+                <w:rFonts w:ascii="Calibri" w:hAnsi="Calibri"/>
+                <w:b w:val="0"/>
+                <w:color w:val="000000"/>
+                <w:sz w:val="20"/>
+              </w:rPr>
+              <w:t>.NET 10 self-contained</w:t>
+            </w:r>
+          </w:p>
+        </w:tc>
+        <w:tc>
+          <w:tcPr>
+            <w:tcW w:type="dxa" w:w="6912"/>
+          </w:tcPr>
+          <w:p>
+            <w:pPr>
+              <w:spacing w:after="100" w:before="80"/>
+            </w:pPr>
+            <w:r>
+              <w:rPr>
+                <w:rFonts w:ascii="Calibri" w:hAnsi="Calibri"/>
+                <w:b w:val="0"/>
+                <w:color w:val="000000"/>
+                <w:sz w:val="20"/>
+              </w:rPr>
+              <w:t>Publish win-x64, đóng kèm runtime 10.0.12 và WinForms; máy khách không phải cài .NET riêng.</w:t>
+            </w:r>
+          </w:p>
+        </w:tc>
+      </w:tr>
+      <w:tr>
+        <w:trPr>
+          <w:cantSplit/>
+        </w:trPr>
+        <w:tc>
+          <w:tcPr>
+            <w:tcW w:type="dxa" w:w="2448"/>
+          </w:tcPr>
+          <w:p>
+            <w:pPr>
+              <w:spacing w:after="100" w:before="80"/>
+            </w:pPr>
+            <w:r>
+              <w:rPr>
+                <w:rFonts w:ascii="Calibri" w:hAnsi="Calibri"/>
+                <w:b w:val="0"/>
+                <w:color w:val="000000"/>
+                <w:sz w:val="20"/>
+              </w:rPr>
+              <w:t>Inno Setup 6.7.3</w:t>
+            </w:r>
+          </w:p>
+        </w:tc>
+        <w:tc>
+          <w:tcPr>
+            <w:tcW w:type="dxa" w:w="6912"/>
+          </w:tcPr>
+          <w:p>
+            <w:pPr>
+              <w:spacing w:after="100" w:before="80"/>
+            </w:pPr>
+            <w:r>
+              <w:rPr>
+                <w:rFonts w:ascii="Calibri" w:hAnsi="Calibri"/>
+                <w:b w:val="0"/>
+                <w:color w:val="000000"/>
+                <w:sz w:val="20"/>
+              </w:rPr>
+              <w:t>Biên dịch script Installer/VioWare.iss thành EXE cài đặt, shortcut, cập nhật và gỡ ứng dụng.</w:t>
+            </w:r>
+          </w:p>
+        </w:tc>
+      </w:tr>
+      <w:tr>
+        <w:trPr>
+          <w:cantSplit/>
+        </w:trPr>
+        <w:tc>
+          <w:tcPr>
+            <w:tcW w:type="dxa" w:w="2448"/>
+          </w:tcPr>
+          <w:p>
+            <w:pPr>
+              <w:spacing w:after="100" w:before="80"/>
+            </w:pPr>
+            <w:r>
+              <w:rPr>
+                <w:rFonts w:ascii="Calibri" w:hAnsi="Calibri"/>
+                <w:b w:val="0"/>
+                <w:color w:val="000000"/>
+                <w:sz w:val="20"/>
+              </w:rPr>
+              <w:t>Windows Package Manager winget</w:t>
+            </w:r>
+          </w:p>
+        </w:tc>
+        <w:tc>
+          <w:tcPr>
+            <w:tcW w:type="dxa" w:w="6912"/>
+          </w:tcPr>
+          <w:p>
+            <w:pPr>
+              <w:spacing w:after="100" w:before="80"/>
+            </w:pPr>
+            <w:r>
+              <w:rPr>
+                <w:rFonts w:ascii="Calibri" w:hAnsi="Calibri"/>
+                <w:b w:val="0"/>
+                <w:color w:val="000000"/>
+                <w:sz w:val="20"/>
+              </w:rPr>
+              <w:t>Tải SQL Server Express và MSI Tailscale từ nguồn chính thức; winget xác minh hash gói tải.</w:t>
+            </w:r>
+          </w:p>
+        </w:tc>
+      </w:tr>
+      <w:tr>
+        <w:trPr>
+          <w:cantSplit/>
+        </w:trPr>
+        <w:tc>
+          <w:tcPr>
+            <w:tcW w:type="dxa" w:w="2448"/>
+          </w:tcPr>
+          <w:p>
+            <w:pPr>
+              <w:spacing w:after="100" w:before="80"/>
+            </w:pPr>
+            <w:r>
+              <w:rPr>
+                <w:rFonts w:ascii="Calibri" w:hAnsi="Calibri"/>
+                <w:b w:val="0"/>
+                <w:color w:val="000000"/>
+                <w:sz w:val="20"/>
+              </w:rPr>
+              <w:t>SQL Server 2025 Express</w:t>
+            </w:r>
+          </w:p>
+        </w:tc>
+        <w:tc>
+          <w:tcPr>
+            <w:tcW w:type="dxa" w:w="6912"/>
+          </w:tcPr>
+          <w:p>
+            <w:pPr>
+              <w:spacing w:after="100" w:before="80"/>
+            </w:pPr>
+            <w:r>
+              <w:rPr>
+                <w:rFonts w:ascii="Calibri" w:hAnsi="Calibri"/>
+                <w:b w:val="0"/>
+                <w:color w:val="000000"/>
+                <w:sz w:val="20"/>
+              </w:rPr>
+              <w:t>Instance SQLEXPRESS chạy database mới; Developer trên default instance tiếp tục phục vụ TEST.</w:t>
+            </w:r>
+          </w:p>
+        </w:tc>
+      </w:tr>
+      <w:tr>
+        <w:trPr>
+          <w:cantSplit/>
+        </w:trPr>
+        <w:tc>
+          <w:tcPr>
+            <w:tcW w:type="dxa" w:w="2448"/>
+          </w:tcPr>
+          <w:p>
+            <w:pPr>
+              <w:spacing w:after="100" w:before="80"/>
+            </w:pPr>
+            <w:r>
+              <w:rPr>
+                <w:rFonts w:ascii="Calibri" w:hAnsi="Calibri"/>
+                <w:b w:val="0"/>
+                <w:color w:val="000000"/>
+                <w:sz w:val="20"/>
+              </w:rPr>
+              <w:t>EF Core 10.0.12 Migrations</w:t>
+            </w:r>
+          </w:p>
+        </w:tc>
+        <w:tc>
+          <w:tcPr>
+            <w:tcW w:type="dxa" w:w="6912"/>
+          </w:tcPr>
+          <w:p>
+            <w:pPr>
+              <w:spacing w:after="100" w:before="80"/>
+            </w:pPr>
+            <w:r>
+              <w:rPr>
+                <w:rFonts w:ascii="Calibri" w:hAnsi="Calibri"/>
+                <w:b w:val="0"/>
+                <w:color w:val="000000"/>
+                <w:sz w:val="20"/>
+              </w:rPr>
+              <w:t>Tạo và cập nhật schema bằng 6 migrations đã có; triển khai riêng bằng tài khoản quản trị.</w:t>
+            </w:r>
+          </w:p>
+        </w:tc>
+      </w:tr>
+      <w:tr>
+        <w:trPr>
+          <w:cantSplit/>
+        </w:trPr>
+        <w:tc>
+          <w:tcPr>
+            <w:tcW w:type="dxa" w:w="2448"/>
+          </w:tcPr>
+          <w:p>
+            <w:pPr>
+              <w:spacing w:after="100" w:before="80"/>
+            </w:pPr>
+            <w:r>
+              <w:rPr>
+                <w:rFonts w:ascii="Calibri" w:hAnsi="Calibri"/>
+                <w:b w:val="0"/>
+                <w:color w:val="000000"/>
+                <w:sz w:val="20"/>
+              </w:rPr>
+              <w:t>Tailscale 1.104.1</w:t>
+            </w:r>
+          </w:p>
+        </w:tc>
+        <w:tc>
+          <w:tcPr>
+            <w:tcW w:type="dxa" w:w="6912"/>
+          </w:tcPr>
+          <w:p>
+            <w:pPr>
+              <w:spacing w:after="100" w:before="80"/>
+            </w:pPr>
+            <w:r>
+              <w:rPr>
+                <w:rFonts w:ascii="Calibri" w:hAnsi="Calibri"/>
+                <w:b w:val="0"/>
+                <w:color w:val="000000"/>
+                <w:sz w:val="20"/>
+              </w:rPr>
+              <w:t>Mạng riêng cho các máy khác mạng; bộ cài kèm MSI tùy chọn, người dùng tự đăng nhập và chờ cấp quyền.</w:t>
+            </w:r>
+          </w:p>
+        </w:tc>
+      </w:tr>
+      <w:tr>
+        <w:trPr>
+          <w:cantSplit/>
+        </w:trPr>
+        <w:tc>
+          <w:tcPr>
+            <w:tcW w:type="dxa" w:w="2448"/>
+          </w:tcPr>
+          <w:p>
+            <w:pPr>
+              <w:spacing w:after="100" w:before="80"/>
+            </w:pPr>
+            <w:r>
+              <w:rPr>
+                <w:rFonts w:ascii="Calibri" w:hAnsi="Calibri"/>
+                <w:b w:val="0"/>
+                <w:color w:val="000000"/>
+                <w:sz w:val="20"/>
+              </w:rPr>
+              <w:t>Windows DPAPI CurrentUser</w:t>
+            </w:r>
+          </w:p>
+        </w:tc>
+        <w:tc>
+          <w:tcPr>
+            <w:tcW w:type="dxa" w:w="6912"/>
+          </w:tcPr>
+          <w:p>
+            <w:pPr>
+              <w:spacing w:after="100" w:before="80"/>
+            </w:pPr>
+            <w:r>
+              <w:rPr>
+                <w:rFonts w:ascii="Calibri" w:hAnsi="Calibri"/>
+                <w:b w:val="0"/>
+                <w:color w:val="000000"/>
+                <w:sz w:val="20"/>
+              </w:rPr>
+              <w:t>Mã hóa cấu hình kết nối theo người dùng Windows; profile riêng nằm ngoài thư mục cài đặt.</w:t>
+            </w:r>
+          </w:p>
+        </w:tc>
+      </w:tr>
+      <w:tr>
+        <w:trPr>
+          <w:cantSplit/>
+        </w:trPr>
+        <w:tc>
+          <w:tcPr>
+            <w:tcW w:type="dxa" w:w="2448"/>
+          </w:tcPr>
+          <w:p>
+            <w:pPr>
+              <w:spacing w:after="100" w:before="80"/>
+            </w:pPr>
+            <w:r>
+              <w:rPr>
+                <w:rFonts w:ascii="Calibri" w:hAnsi="Calibri"/>
+                <w:b w:val="0"/>
+                <w:color w:val="000000"/>
+                <w:sz w:val="20"/>
+              </w:rPr>
+              <w:t>Azure Data Studio và sqlcmd</w:t>
+            </w:r>
+          </w:p>
+        </w:tc>
+        <w:tc>
+          <w:tcPr>
+            <w:tcW w:type="dxa" w:w="6912"/>
+          </w:tcPr>
+          <w:p>
+            <w:pPr>
+              <w:spacing w:after="100" w:before="80"/>
+            </w:pPr>
+            <w:r>
+              <w:rPr>
+                <w:rFonts w:ascii="Calibri" w:hAnsi="Calibri"/>
+                <w:b w:val="0"/>
+                <w:color w:val="000000"/>
+                <w:sz w:val="20"/>
+              </w:rPr>
+              <w:t>Người dùng kết nối SQL bằng Azure Data Studio; sqlcmd kiểm tra edition, migration và quyền kết nối. ADS đã ngừng hỗ trợ, SSMS là lựa chọn được hỗ trợ lâu dài.</w:t>
+            </w:r>
+          </w:p>
+        </w:tc>
+      </w:tr>
+    </w:tbl>
+    <w:p>
+      <w:pPr>
+        <w:pStyle w:val="Heading2"/>
+      </w:pPr>
+      <w:r>
+        <w:rPr>
+          <w:color w:val="000000"/>
+        </w:rPr>
+        <w:t>Các lớp bảo vệ và cấu hình máy khách</w:t>
+      </w:r>
+    </w:p>
+    <w:p>
+      <w:r>
+        <w:t>SQL login của ứng dụng, tài khoản đăng nhập VioWare và danh tính VPN là ba thành phần khác nhau. SQL login vioware_app chỉ được cấp quyền runtime trên các bảng nghiệp vụ và sequence chuyển kho; không có sysadmin, db_owner hoặc quyền sửa schema. Quyền history/log/movement được giới hạn đọc và thêm; việc cấp quyền qua VPN và firewall do quản trị viên thực hiện.</w:t>
+      </w:r>
+    </w:p>
+    <w:p>
+      <w:r>
+        <w:t>Màn hình kết nối có địa chỉ server, cổng, database, thông tin xác thực và kiểm tra kết nối chỉ đọc. Lưu chỉ được bật sau lần kiểm tra thành công; đổi thông tin bắt buộc kiểm tra lại. Lỗi kết nối được trình bày bằng hướng dẫn kiểm tra VPN, quyền, địa chỉ và chứng chỉ, không hiển thị lỗi SQL hoặc mật khẩu. Người dùng có thể đóng và quay lại bằng shortcut cấu hình hoặc link trên màn hình đăng nhập.</w:t>
+      </w:r>
+    </w:p>
+    <w:p>
+      <w:r>
+        <w:t>Cấu hình được lưu trong LOCALAPPDATA/VioWare/connection.dat bằng DPAPI theo tài khoản Windows, không nằm trong bộ cài và không lưu mật khẩu dạng rõ. DPAPI không thay thế quyền mạng hoặc SQL; mã chạy cùng quyền Windows vẫn có khả năng giải mã. Ưu tiên connection là biến môi trường, profile DPAPI, rồi XML legacy. Mã hóa đường truyền bật mặc định; chứng chỉ tự ký chỉ được chấp nhận khi quản trị viên hướng dẫn.</w:t>
+      </w:r>
+    </w:p>
+    <w:p>
+      <w:pPr>
+        <w:pStyle w:val="Heading2"/>
+      </w:pPr>
+      <w:r>
+        <w:rPr>
+          <w:color w:val="000000"/>
+        </w:rPr>
+        <w:t>Kết quả đã xác nhận và giới hạn triển khai</w:t>
+      </w:r>
+    </w:p>
+    <w:p>
+      <w:r>
+        <w:t>Ngày 15/10/2026 đã tạo SmartInventoryManagerProductionDB trên SQL Express 17.0.1000.7: 6 migrations, 19 bảng nghiệp vụ, 3 role và 1 ADMIN do người dùng bootstrap tương tác. Kết nối TCP cổng 14330, SQL login runtime và đăng nhập VioWare trên máy chủ đã được xác nhận. Người dùng thông báo đã kiểm thử cục bộ; đây không phải xác nhận kiểm thử độc lập mọi thao tác ghi production.</w:t>
+      </w:r>
+    </w:p>
+    <w:p>
+      <w:r>
+        <w:t>Bản source mới build 7 project đạt 0 lỗi và 0 cảnh báo. Hai suite đạt tổng cộng 179/179 tests: 169 unit nghiệp vụ, 5 SQL trên TEST và 5 kiểm tra DPAPI/connection profile. Harness xác minh thay đổi target làm mất hiệu lực kiểm tra cũ, lưu sau kiểm tra, dữ liệu mã hóa hỏng và trạng thái không có kết nối; form được kiểm tra ở hai kích thước, có thể cuộn tới trạng thái khi cửa sổ nhỏ. Native Windows kiểm tra màn hình cấu hình, báo thiếu thông tin và đóng để cấu hình sau.</w:t>
+      </w:r>
+    </w:p>
+    <w:p>
+      <w:r>
+        <w:t>Chưa nghiệm thu cài mới trên máy sạch, bước MSI Tailscale/UAC, cập nhật/gỡ cài đặt, kết nối SQL từ máy khác qua VPN, certificate production, backup/restore và DPI Windows thực tế. Việc cài VPN hoặc chấp nhận lời mời không tự cấp quyền DB. Bộ cài không nhúng mật khẩu, VPN authkey, SQL Server hoặc dữ liệu; runtime đã đóng kèm cần được publish lại khi cập nhật bản vá .NET.</w:t>
+      </w:r>
+    </w:p>
+    <w:p>
+      <w:pPr>
+        <w:pStyle w:val="Heading2"/>
+      </w:pPr>
+      <w:r>
+        <w:rPr>
+          <w:color w:val="000000"/>
+        </w:rPr>
+        <w:t>Triển khai tại máy chủ công ty</w:t>
+      </w:r>
+    </w:p>
+    <w:p>
+      <w:r>
+        <w:t>IT cần phê duyệt SQL edition, mạng riêng, chứng chỉ và quy tắc truy cập. Có thể backup/restore DB hiện tại để giữ dữ liệu và tài khoản VioWare, hoặc tạo database trắng bằng migrations. SQL login cấp server phải tạo và map lại đúng quyền; backup database không tự mang theo server login. Kiểm tra trên server mới, chốt thời điểm chuyển rồi ngừng ghi DB cũ để tránh dữ liệu tách đôi. Máy khách đổi địa chỉ/cổng trong màn hình cấu hình và kiểm tra lại, không cần sửa source chỉ vì đổi server.</w:t>
+      </w:r>
+    </w:p>
+    <w:p>
+      <w:pPr>
+        <w:pStyle w:val="Heading2"/>
+      </w:pPr>
+      <w:r>
+        <w:rPr>
+          <w:color w:val="000000"/>
+        </w:rPr>
+        <w:t>Lời dẫn thuyết trình</w:t>
+      </w:r>
+    </w:p>
+    <w:p>
+      <w:r>
+        <w:t>“Nhóm đóng gói VioWare thành ứng dụng Windows x64 kèm runtime .NET, sử dụng Inno Setup để người dùng cài đặt thuận tiện. Dữ liệu tập trung trên SQL Server Express, schema quản lý bằng EF Migrations. Máy khách có thể cài trước và chờ quản trị viên cấp quyền qua Tailscale. Thông tin kết nối được kiểm tra trước khi lưu và mã hóa theo tài khoản Windows. Nếu chuyển sang máy chủ công ty, nhóm thay cấu hình kết nối sau khi bàn giao database và quyền truy cập.”</w:t>
+      </w:r>
+    </w:p>
+    <w:p>
+      <w:pPr>
+        <w:pStyle w:val="Heading2"/>
+      </w:pPr>
+      <w:r>
+        <w:rPr>
+          <w:color w:val="000000"/>
+        </w:rPr>
+        <w:t>Nguồn đối chiếu triển khai</w:t>
+      </w:r>
+    </w:p>
+    <w:p>
+      <w:r>
+        <w:t>Mã nguồn: Installer/VioWare.iss; UI/Components/ConnectionProfile.cs, ConnectionSettingsStore.cs; UI/Forms/Settings/FrmConnectionSettings.cs; Data/Queries/DatabaseConnectionProbe.cs; SmartInventoryManager.UI.Tests; Documentation/Deployment. Tài liệu chính thức: learn.microsoft.com/dotnet/core/deploying; jrsoftware.org/ishelp; microsoft.com/sql-server/sql-server-downloads; tailscale.com/docs/how-to/quickstart. Cập nhật 15/10/2026; việc đăng Release và archive repo được ghi riêng trong báo cáo tiến độ sau khi hoàn tất.</w:t>
+      </w:r>
+    </w:p>
+    <w:p>
+      <w:r>
+        <w:br w:type="page"/>
+      </w:r>
+    </w:p>
+    <w:p>
+      <w:pPr>
+        <w:pStyle w:val="Heading1"/>
+      </w:pPr>
+      <w:r>
+        <w:t>17 Nguồn đối chiếu và dấu vết phiên bản</w:t>
+      </w:r>
+    </w:p>
+    <w:p>
+      <w:r>
+        <w:t>Ngày chốt nội dung 15 tháng 10 năm 2026. Các mốc Business 06fc858, UI adca0b7 và tài liệu 6e1091b là lịch sử trước đợt bàn giao. Nội dung kiểm thử, triển khai và bộ cài được cập nhật trong chương 13 và 16 từ kết quả hiện hành trên nhánh Backend; bản source phát hành cố định dự kiến theo tag v1.0.1.</w:t>
       </w:r>
     </w:p>
     <w:tbl>

</xml_diff>